<commit_message>
Manual de utilizador com imagens dos ecra
</commit_message>
<xml_diff>
--- a/docs/Manual-Utilizador.docx
+++ b/docs/Manual-Utilizador.docx
@@ -19,7 +19,7 @@
     <w:p>
       <w:pPr>
         <w:shd w:val="clear" w:color="auto" w:fill="F5F5F5"/>
-        <w:divId w:val="502668275"/>
+        <w:divId w:val="1266842781"/>
         <w:rPr>
           <w:rFonts w:ascii="Segoe UI" w:eastAsia="Times New Roman" w:hAnsi="Segoe UI" w:cs="Segoe UI"/>
           <w:color w:val="222222"/>
@@ -204,7 +204,7 @@
     <w:p>
       <w:pPr>
         <w:shd w:val="clear" w:color="auto" w:fill="F5F5F5"/>
-        <w:divId w:val="1068916536"/>
+        <w:divId w:val="1369602483"/>
         <w:rPr>
           <w:rFonts w:ascii="Segoe UI" w:eastAsia="Times New Roman" w:hAnsi="Segoe UI" w:cs="Segoe UI"/>
           <w:color w:val="222222"/>
@@ -391,7 +391,7 @@
     <w:p>
       <w:pPr>
         <w:jc w:val="center"/>
-        <w:divId w:val="1356349667"/>
+        <w:divId w:val="50231145"/>
         <w:rPr>
           <w:rFonts w:ascii="Segoe UI" w:eastAsia="Times New Roman" w:hAnsi="Segoe UI" w:cs="Segoe UI"/>
           <w:color w:val="222222"/>
@@ -407,12 +407,11 @@
           <w:sz w:val="22"/>
           <w:szCs w:val="22"/>
         </w:rPr>
-        <w:lastRenderedPageBreak/>
         <w:drawing>
-          <wp:inline distT="0" distB="0" distL="0" distR="0" wp14:anchorId="63CA64F0" wp14:editId="668F4997">
-            <wp:extent cx="10287000" cy="22860000"/>
-            <wp:effectExtent l="0" t="0" r="0" b="0"/>
-            <wp:docPr id="1" name="Imagem 1" descr="Ecrã de login"/>
+          <wp:inline distT="0" distB="0" distL="0" distR="0" wp14:anchorId="3CA53E2D" wp14:editId="361D93CF">
+            <wp:extent cx="2921000" cy="6490905"/>
+            <wp:effectExtent l="0" t="0" r="0" b="5715"/>
+            <wp:docPr id="7" name="Imagem 7"/>
             <wp:cNvGraphicFramePr>
               <a:graphicFrameLocks xmlns:a="http://schemas.openxmlformats.org/drawingml/2006/main" noChangeAspect="1"/>
             </wp:cNvGraphicFramePr>
@@ -420,36 +419,29 @@
               <a:graphicData uri="http://schemas.openxmlformats.org/drawingml/2006/picture">
                 <pic:pic xmlns:pic="http://schemas.openxmlformats.org/drawingml/2006/picture">
                   <pic:nvPicPr>
-                    <pic:cNvPr id="0" name="Picture 1" descr="Ecrã de login"/>
-                    <pic:cNvPicPr>
-                      <a:picLocks noChangeAspect="1" noChangeArrowheads="1"/>
-                    </pic:cNvPicPr>
+                    <pic:cNvPr id="7" name=""/>
+                    <pic:cNvPicPr/>
                   </pic:nvPicPr>
                   <pic:blipFill>
-                    <a:blip r:link="rId5">
+                    <a:blip r:embed="rId5" cstate="print">
                       <a:extLst>
                         <a:ext uri="{28A0092B-C50C-407E-A947-70E740481C1C}">
                           <a14:useLocalDpi xmlns:a14="http://schemas.microsoft.com/office/drawing/2010/main" val="0"/>
                         </a:ext>
                       </a:extLst>
                     </a:blip>
-                    <a:srcRect/>
                     <a:stretch>
                       <a:fillRect/>
                     </a:stretch>
                   </pic:blipFill>
-                  <pic:spPr bwMode="auto">
+                  <pic:spPr>
                     <a:xfrm>
                       <a:off x="0" y="0"/>
-                      <a:ext cx="10287000" cy="22860000"/>
+                      <a:ext cx="2921000" cy="6490905"/>
                     </a:xfrm>
                     <a:prstGeom prst="rect">
                       <a:avLst/>
                     </a:prstGeom>
-                    <a:noFill/>
-                    <a:ln>
-                      <a:noFill/>
-                    </a:ln>
                   </pic:spPr>
                 </pic:pic>
               </a:graphicData>
@@ -461,7 +453,7 @@
     <w:p>
       <w:pPr>
         <w:jc w:val="center"/>
-        <w:divId w:val="269047412"/>
+        <w:divId w:val="466583421"/>
         <w:rPr>
           <w:rFonts w:ascii="Segoe UI" w:eastAsia="Times New Roman" w:hAnsi="Segoe UI" w:cs="Segoe UI"/>
           <w:color w:val="666666"/>
@@ -476,7 +468,6 @@
           <w:sz w:val="18"/>
           <w:szCs w:val="18"/>
         </w:rPr>
-        <w:lastRenderedPageBreak/>
         <w:t>Ecrã de entrada</w:t>
       </w:r>
     </w:p>
@@ -573,7 +564,7 @@
     <w:p>
       <w:pPr>
         <w:jc w:val="center"/>
-        <w:divId w:val="808670060"/>
+        <w:divId w:val="262106415"/>
         <w:rPr>
           <w:rFonts w:ascii="Segoe UI" w:eastAsia="Times New Roman" w:hAnsi="Segoe UI" w:cs="Segoe UI"/>
           <w:color w:val="222222"/>
@@ -589,12 +580,11 @@
           <w:sz w:val="22"/>
           <w:szCs w:val="22"/>
         </w:rPr>
-        <w:lastRenderedPageBreak/>
         <w:drawing>
-          <wp:inline distT="0" distB="0" distL="0" distR="0" wp14:anchorId="2207101B" wp14:editId="0401A504">
-            <wp:extent cx="10287000" cy="22860000"/>
-            <wp:effectExtent l="0" t="0" r="0" b="0"/>
-            <wp:docPr id="2" name="Imagem 2" descr="Lista de projetos"/>
+          <wp:inline distT="0" distB="0" distL="0" distR="0" wp14:anchorId="567C90A8" wp14:editId="774F3E7F">
+            <wp:extent cx="2921000" cy="6490905"/>
+            <wp:effectExtent l="0" t="0" r="0" b="5715"/>
+            <wp:docPr id="3" name="Imagem 3"/>
             <wp:cNvGraphicFramePr>
               <a:graphicFrameLocks xmlns:a="http://schemas.openxmlformats.org/drawingml/2006/main" noChangeAspect="1"/>
             </wp:cNvGraphicFramePr>
@@ -602,36 +592,29 @@
               <a:graphicData uri="http://schemas.openxmlformats.org/drawingml/2006/picture">
                 <pic:pic xmlns:pic="http://schemas.openxmlformats.org/drawingml/2006/picture">
                   <pic:nvPicPr>
-                    <pic:cNvPr id="0" name="Picture 2" descr="Lista de projetos"/>
-                    <pic:cNvPicPr>
-                      <a:picLocks noChangeAspect="1" noChangeArrowheads="1"/>
-                    </pic:cNvPicPr>
+                    <pic:cNvPr id="3" name=""/>
+                    <pic:cNvPicPr/>
                   </pic:nvPicPr>
                   <pic:blipFill>
-                    <a:blip r:link="rId6">
+                    <a:blip r:embed="rId6" cstate="print">
                       <a:extLst>
                         <a:ext uri="{28A0092B-C50C-407E-A947-70E740481C1C}">
                           <a14:useLocalDpi xmlns:a14="http://schemas.microsoft.com/office/drawing/2010/main" val="0"/>
                         </a:ext>
                       </a:extLst>
                     </a:blip>
-                    <a:srcRect/>
                     <a:stretch>
                       <a:fillRect/>
                     </a:stretch>
                   </pic:blipFill>
-                  <pic:spPr bwMode="auto">
+                  <pic:spPr>
                     <a:xfrm>
                       <a:off x="0" y="0"/>
-                      <a:ext cx="10287000" cy="22860000"/>
+                      <a:ext cx="2921000" cy="6490905"/>
                     </a:xfrm>
                     <a:prstGeom prst="rect">
                       <a:avLst/>
                     </a:prstGeom>
-                    <a:noFill/>
-                    <a:ln>
-                      <a:noFill/>
-                    </a:ln>
                   </pic:spPr>
                 </pic:pic>
               </a:graphicData>
@@ -643,7 +626,7 @@
     <w:p>
       <w:pPr>
         <w:jc w:val="center"/>
-        <w:divId w:val="1557277080"/>
+        <w:divId w:val="463278325"/>
         <w:rPr>
           <w:rFonts w:ascii="Segoe UI" w:eastAsia="Times New Roman" w:hAnsi="Segoe UI" w:cs="Segoe UI"/>
           <w:color w:val="666666"/>
@@ -658,7 +641,6 @@
           <w:sz w:val="18"/>
           <w:szCs w:val="18"/>
         </w:rPr>
-        <w:lastRenderedPageBreak/>
         <w:t>Lista de projetos</w:t>
       </w:r>
     </w:p>
@@ -817,6 +799,7 @@
           <w:sz w:val="22"/>
           <w:szCs w:val="22"/>
         </w:rPr>
+        <w:lastRenderedPageBreak/>
         <w:t xml:space="preserve">Para criar uma tarefa nova, toque no botão </w:t>
       </w:r>
       <w:r>
@@ -928,7 +911,7 @@
     <w:p>
       <w:pPr>
         <w:jc w:val="center"/>
-        <w:divId w:val="1029910024"/>
+        <w:divId w:val="940256841"/>
         <w:rPr>
           <w:rFonts w:ascii="Segoe UI" w:eastAsia="Times New Roman" w:hAnsi="Segoe UI" w:cs="Segoe UI"/>
           <w:color w:val="222222"/>
@@ -944,12 +927,11 @@
           <w:sz w:val="22"/>
           <w:szCs w:val="22"/>
         </w:rPr>
-        <w:lastRenderedPageBreak/>
         <w:drawing>
-          <wp:inline distT="0" distB="0" distL="0" distR="0" wp14:anchorId="4E244FB0" wp14:editId="6211E67B">
-            <wp:extent cx="10287000" cy="22860000"/>
-            <wp:effectExtent l="0" t="0" r="0" b="0"/>
-            <wp:docPr id="3" name="Imagem 3" descr="Quadro do projeto"/>
+          <wp:inline distT="0" distB="0" distL="0" distR="0" wp14:anchorId="1BC18DC0" wp14:editId="5FCA84A3">
+            <wp:extent cx="2921000" cy="6490905"/>
+            <wp:effectExtent l="0" t="0" r="0" b="5715"/>
+            <wp:docPr id="2" name="Imagem 2"/>
             <wp:cNvGraphicFramePr>
               <a:graphicFrameLocks xmlns:a="http://schemas.openxmlformats.org/drawingml/2006/main" noChangeAspect="1"/>
             </wp:cNvGraphicFramePr>
@@ -957,36 +939,29 @@
               <a:graphicData uri="http://schemas.openxmlformats.org/drawingml/2006/picture">
                 <pic:pic xmlns:pic="http://schemas.openxmlformats.org/drawingml/2006/picture">
                   <pic:nvPicPr>
-                    <pic:cNvPr id="0" name="Picture 3" descr="Quadro do projeto"/>
-                    <pic:cNvPicPr>
-                      <a:picLocks noChangeAspect="1" noChangeArrowheads="1"/>
-                    </pic:cNvPicPr>
+                    <pic:cNvPr id="2" name=""/>
+                    <pic:cNvPicPr/>
                   </pic:nvPicPr>
                   <pic:blipFill>
-                    <a:blip r:link="rId7">
+                    <a:blip r:embed="rId7" cstate="print">
                       <a:extLst>
                         <a:ext uri="{28A0092B-C50C-407E-A947-70E740481C1C}">
                           <a14:useLocalDpi xmlns:a14="http://schemas.microsoft.com/office/drawing/2010/main" val="0"/>
                         </a:ext>
                       </a:extLst>
                     </a:blip>
-                    <a:srcRect/>
                     <a:stretch>
                       <a:fillRect/>
                     </a:stretch>
                   </pic:blipFill>
-                  <pic:spPr bwMode="auto">
+                  <pic:spPr>
                     <a:xfrm>
                       <a:off x="0" y="0"/>
-                      <a:ext cx="10287000" cy="22860000"/>
+                      <a:ext cx="2921000" cy="6490905"/>
                     </a:xfrm>
                     <a:prstGeom prst="rect">
                       <a:avLst/>
                     </a:prstGeom>
-                    <a:noFill/>
-                    <a:ln>
-                      <a:noFill/>
-                    </a:ln>
                   </pic:spPr>
                 </pic:pic>
               </a:graphicData>
@@ -998,7 +973,7 @@
     <w:p>
       <w:pPr>
         <w:jc w:val="center"/>
-        <w:divId w:val="1905096050"/>
+        <w:divId w:val="64841033"/>
         <w:rPr>
           <w:rFonts w:ascii="Segoe UI" w:eastAsia="Times New Roman" w:hAnsi="Segoe UI" w:cs="Segoe UI"/>
           <w:color w:val="666666"/>
@@ -1070,16 +1045,7 @@
           <w:sz w:val="22"/>
           <w:szCs w:val="22"/>
         </w:rPr>
-        <w:t xml:space="preserve"> </w:t>
-      </w:r>
-      <w:r>
-        <w:rPr>
-          <w:rFonts w:ascii="Segoe UI" w:eastAsia="Times New Roman" w:hAnsi="Segoe UI" w:cs="Segoe UI"/>
-          <w:color w:val="222222"/>
-          <w:sz w:val="22"/>
-          <w:szCs w:val="22"/>
-        </w:rPr>
-        <w:t>para criar (ou abra uma tarefa e toque no lápis para editar).</w:t>
+        <w:t xml:space="preserve"> para criar (ou abra uma tarefa e toque no lápis para editar).</w:t>
       </w:r>
     </w:p>
     <w:p>
@@ -1256,9 +1222,8 @@
     </w:p>
     <w:p>
       <w:pPr>
-        <w:spacing w:before="210"/>
         <w:jc w:val="center"/>
-        <w:divId w:val="1949578053"/>
+        <w:divId w:val="1797483937"/>
         <w:rPr>
           <w:rFonts w:ascii="Segoe UI" w:eastAsia="Times New Roman" w:hAnsi="Segoe UI" w:cs="Segoe UI"/>
           <w:color w:val="222222"/>
@@ -1275,10 +1240,10 @@
           <w:szCs w:val="22"/>
         </w:rPr>
         <w:drawing>
-          <wp:inline distT="0" distB="0" distL="0" distR="0" wp14:anchorId="63C3EAD4" wp14:editId="6E14A14D">
-            <wp:extent cx="10287000" cy="22860000"/>
-            <wp:effectExtent l="0" t="0" r="0" b="0"/>
-            <wp:docPr id="4" name="Imagem 4" descr="Formulário de tarefa"/>
+          <wp:inline distT="0" distB="0" distL="0" distR="0" wp14:anchorId="1D7CC0C5" wp14:editId="6E7D80FE">
+            <wp:extent cx="2921000" cy="6490905"/>
+            <wp:effectExtent l="0" t="0" r="0" b="5715"/>
+            <wp:docPr id="4" name="Imagem 4"/>
             <wp:cNvGraphicFramePr>
               <a:graphicFrameLocks xmlns:a="http://schemas.openxmlformats.org/drawingml/2006/main" noChangeAspect="1"/>
             </wp:cNvGraphicFramePr>
@@ -1286,36 +1251,29 @@
               <a:graphicData uri="http://schemas.openxmlformats.org/drawingml/2006/picture">
                 <pic:pic xmlns:pic="http://schemas.openxmlformats.org/drawingml/2006/picture">
                   <pic:nvPicPr>
-                    <pic:cNvPr id="0" name="Picture 4" descr="Formulário de tarefa"/>
-                    <pic:cNvPicPr>
-                      <a:picLocks noChangeAspect="1" noChangeArrowheads="1"/>
-                    </pic:cNvPicPr>
+                    <pic:cNvPr id="4" name=""/>
+                    <pic:cNvPicPr/>
                   </pic:nvPicPr>
                   <pic:blipFill>
-                    <a:blip r:link="rId8">
+                    <a:blip r:embed="rId8" cstate="print">
                       <a:extLst>
                         <a:ext uri="{28A0092B-C50C-407E-A947-70E740481C1C}">
                           <a14:useLocalDpi xmlns:a14="http://schemas.microsoft.com/office/drawing/2010/main" val="0"/>
                         </a:ext>
                       </a:extLst>
                     </a:blip>
-                    <a:srcRect/>
                     <a:stretch>
                       <a:fillRect/>
                     </a:stretch>
                   </pic:blipFill>
-                  <pic:spPr bwMode="auto">
+                  <pic:spPr>
                     <a:xfrm>
                       <a:off x="0" y="0"/>
-                      <a:ext cx="10287000" cy="22860000"/>
+                      <a:ext cx="2921000" cy="6490905"/>
                     </a:xfrm>
                     <a:prstGeom prst="rect">
                       <a:avLst/>
                     </a:prstGeom>
-                    <a:noFill/>
-                    <a:ln>
-                      <a:noFill/>
-                    </a:ln>
                   </pic:spPr>
                 </pic:pic>
               </a:graphicData>
@@ -1326,9 +1284,8 @@
     </w:p>
     <w:p>
       <w:pPr>
-        <w:spacing w:before="60" w:after="210"/>
         <w:jc w:val="center"/>
-        <w:divId w:val="1155562928"/>
+        <w:divId w:val="1093281120"/>
         <w:rPr>
           <w:rFonts w:ascii="Segoe UI" w:eastAsia="Times New Roman" w:hAnsi="Segoe UI" w:cs="Segoe UI"/>
           <w:color w:val="666666"/>
@@ -1541,9 +1498,8 @@
     </w:p>
     <w:p>
       <w:pPr>
-        <w:spacing w:before="210"/>
         <w:jc w:val="center"/>
-        <w:divId w:val="602224937"/>
+        <w:divId w:val="83891095"/>
         <w:rPr>
           <w:rFonts w:ascii="Segoe UI" w:eastAsia="Times New Roman" w:hAnsi="Segoe UI" w:cs="Segoe UI"/>
           <w:color w:val="222222"/>
@@ -1560,10 +1516,10 @@
           <w:szCs w:val="22"/>
         </w:rPr>
         <w:drawing>
-          <wp:inline distT="0" distB="0" distL="0" distR="0" wp14:anchorId="287D0275" wp14:editId="5ED4032A">
-            <wp:extent cx="10287000" cy="22860000"/>
-            <wp:effectExtent l="0" t="0" r="0" b="0"/>
-            <wp:docPr id="5" name="Imagem 5" descr="Detalhe da tarefa"/>
+          <wp:inline distT="0" distB="0" distL="0" distR="0" wp14:anchorId="149173EB" wp14:editId="423E638A">
+            <wp:extent cx="2921000" cy="6490905"/>
+            <wp:effectExtent l="0" t="0" r="0" b="5715"/>
+            <wp:docPr id="5" name="Imagem 5"/>
             <wp:cNvGraphicFramePr>
               <a:graphicFrameLocks xmlns:a="http://schemas.openxmlformats.org/drawingml/2006/main" noChangeAspect="1"/>
             </wp:cNvGraphicFramePr>
@@ -1571,36 +1527,29 @@
               <a:graphicData uri="http://schemas.openxmlformats.org/drawingml/2006/picture">
                 <pic:pic xmlns:pic="http://schemas.openxmlformats.org/drawingml/2006/picture">
                   <pic:nvPicPr>
-                    <pic:cNvPr id="0" name="Picture 5" descr="Detalhe da tarefa"/>
-                    <pic:cNvPicPr>
-                      <a:picLocks noChangeAspect="1" noChangeArrowheads="1"/>
-                    </pic:cNvPicPr>
+                    <pic:cNvPr id="5" name=""/>
+                    <pic:cNvPicPr/>
                   </pic:nvPicPr>
                   <pic:blipFill>
-                    <a:blip r:link="rId9">
+                    <a:blip r:embed="rId9" cstate="print">
                       <a:extLst>
                         <a:ext uri="{28A0092B-C50C-407E-A947-70E740481C1C}">
                           <a14:useLocalDpi xmlns:a14="http://schemas.microsoft.com/office/drawing/2010/main" val="0"/>
                         </a:ext>
                       </a:extLst>
                     </a:blip>
-                    <a:srcRect/>
                     <a:stretch>
                       <a:fillRect/>
                     </a:stretch>
                   </pic:blipFill>
-                  <pic:spPr bwMode="auto">
+                  <pic:spPr>
                     <a:xfrm>
                       <a:off x="0" y="0"/>
-                      <a:ext cx="10287000" cy="22860000"/>
+                      <a:ext cx="2921000" cy="6490905"/>
                     </a:xfrm>
                     <a:prstGeom prst="rect">
                       <a:avLst/>
                     </a:prstGeom>
-                    <a:noFill/>
-                    <a:ln>
-                      <a:noFill/>
-                    </a:ln>
                   </pic:spPr>
                 </pic:pic>
               </a:graphicData>
@@ -1611,9 +1560,8 @@
     </w:p>
     <w:p>
       <w:pPr>
-        <w:spacing w:before="60" w:after="210"/>
         <w:jc w:val="center"/>
-        <w:divId w:val="1401321495"/>
+        <w:divId w:val="710685816"/>
         <w:rPr>
           <w:rFonts w:ascii="Segoe UI" w:eastAsia="Times New Roman" w:hAnsi="Segoe UI" w:cs="Segoe UI"/>
           <w:color w:val="666666"/>
@@ -1700,16 +1648,7 @@
           <w:sz w:val="22"/>
           <w:szCs w:val="22"/>
         </w:rPr>
-        <w:t xml:space="preserve"> </w:t>
-      </w:r>
-      <w:r>
-        <w:rPr>
-          <w:rFonts w:ascii="Segoe UI" w:hAnsi="Segoe UI" w:cs="Segoe UI"/>
-          <w:color w:val="222222"/>
-          <w:sz w:val="22"/>
-          <w:szCs w:val="22"/>
-        </w:rPr>
-        <w:t xml:space="preserve">dessa pessoa (tem de ser um utilizador já registado) e toque em </w:t>
+        <w:t xml:space="preserve"> dessa pessoa (tem de ser um utilizador já registado) e toque em </w:t>
       </w:r>
       <w:r>
         <w:rPr>
@@ -1733,9 +1672,8 @@
     </w:p>
     <w:p>
       <w:pPr>
-        <w:spacing w:before="210"/>
         <w:jc w:val="center"/>
-        <w:divId w:val="1244216113"/>
+        <w:divId w:val="1342464694"/>
         <w:rPr>
           <w:rFonts w:ascii="Segoe UI" w:eastAsia="Times New Roman" w:hAnsi="Segoe UI" w:cs="Segoe UI"/>
           <w:color w:val="222222"/>
@@ -1752,10 +1690,10 @@
           <w:szCs w:val="22"/>
         </w:rPr>
         <w:drawing>
-          <wp:inline distT="0" distB="0" distL="0" distR="0" wp14:anchorId="068A5919" wp14:editId="0488CAB5">
-            <wp:extent cx="10287000" cy="22860000"/>
-            <wp:effectExtent l="0" t="0" r="0" b="0"/>
-            <wp:docPr id="6" name="Imagem 6" descr="Membros"/>
+          <wp:inline distT="0" distB="0" distL="0" distR="0" wp14:anchorId="313F0A2A" wp14:editId="03E34E45">
+            <wp:extent cx="2921000" cy="6490905"/>
+            <wp:effectExtent l="0" t="0" r="0" b="5715"/>
+            <wp:docPr id="1" name="Imagem 1"/>
             <wp:cNvGraphicFramePr>
               <a:graphicFrameLocks xmlns:a="http://schemas.openxmlformats.org/drawingml/2006/main" noChangeAspect="1"/>
             </wp:cNvGraphicFramePr>
@@ -1763,36 +1701,29 @@
               <a:graphicData uri="http://schemas.openxmlformats.org/drawingml/2006/picture">
                 <pic:pic xmlns:pic="http://schemas.openxmlformats.org/drawingml/2006/picture">
                   <pic:nvPicPr>
-                    <pic:cNvPr id="0" name="Picture 6" descr="Membros"/>
-                    <pic:cNvPicPr>
-                      <a:picLocks noChangeAspect="1" noChangeArrowheads="1"/>
-                    </pic:cNvPicPr>
+                    <pic:cNvPr id="1" name=""/>
+                    <pic:cNvPicPr/>
                   </pic:nvPicPr>
                   <pic:blipFill>
-                    <a:blip r:link="rId10">
+                    <a:blip r:embed="rId10" cstate="print">
                       <a:extLst>
                         <a:ext uri="{28A0092B-C50C-407E-A947-70E740481C1C}">
                           <a14:useLocalDpi xmlns:a14="http://schemas.microsoft.com/office/drawing/2010/main" val="0"/>
                         </a:ext>
                       </a:extLst>
                     </a:blip>
-                    <a:srcRect/>
                     <a:stretch>
                       <a:fillRect/>
                     </a:stretch>
                   </pic:blipFill>
-                  <pic:spPr bwMode="auto">
+                  <pic:spPr>
                     <a:xfrm>
                       <a:off x="0" y="0"/>
-                      <a:ext cx="10287000" cy="22860000"/>
+                      <a:ext cx="2921000" cy="6490905"/>
                     </a:xfrm>
                     <a:prstGeom prst="rect">
                       <a:avLst/>
                     </a:prstGeom>
-                    <a:noFill/>
-                    <a:ln>
-                      <a:noFill/>
-                    </a:ln>
                   </pic:spPr>
                 </pic:pic>
               </a:graphicData>
@@ -1803,9 +1734,8 @@
     </w:p>
     <w:p>
       <w:pPr>
-        <w:spacing w:before="60" w:after="210"/>
         <w:jc w:val="center"/>
-        <w:divId w:val="1937444567"/>
+        <w:divId w:val="244806543"/>
         <w:rPr>
           <w:rFonts w:ascii="Segoe UI" w:eastAsia="Times New Roman" w:hAnsi="Segoe UI" w:cs="Segoe UI"/>
           <w:color w:val="666666"/>
@@ -1834,6 +1764,7 @@
         <w:rPr>
           <w:rFonts w:ascii="Segoe UI" w:eastAsia="Times New Roman" w:hAnsi="Segoe UI" w:cs="Segoe UI"/>
         </w:rPr>
+        <w:lastRenderedPageBreak/>
         <w:t>8. O relatório do projeto</w:t>
       </w:r>
     </w:p>
@@ -1859,9 +1790,8 @@
     </w:p>
     <w:p>
       <w:pPr>
-        <w:spacing w:before="210"/>
         <w:jc w:val="center"/>
-        <w:divId w:val="1376344404"/>
+        <w:divId w:val="1664311356"/>
         <w:rPr>
           <w:rFonts w:ascii="Segoe UI" w:eastAsia="Times New Roman" w:hAnsi="Segoe UI" w:cs="Segoe UI"/>
           <w:color w:val="222222"/>
@@ -1878,10 +1808,10 @@
           <w:szCs w:val="22"/>
         </w:rPr>
         <w:drawing>
-          <wp:inline distT="0" distB="0" distL="0" distR="0" wp14:anchorId="0ED54531" wp14:editId="26CC2E90">
-            <wp:extent cx="10287000" cy="22860000"/>
-            <wp:effectExtent l="0" t="0" r="0" b="0"/>
-            <wp:docPr id="7" name="Imagem 7" descr="Relatório"/>
+          <wp:inline distT="0" distB="0" distL="0" distR="0" wp14:anchorId="1CA2FE9C" wp14:editId="76CBCF79">
+            <wp:extent cx="2921000" cy="6490905"/>
+            <wp:effectExtent l="0" t="0" r="0" b="5715"/>
+            <wp:docPr id="6" name="Imagem 6"/>
             <wp:cNvGraphicFramePr>
               <a:graphicFrameLocks xmlns:a="http://schemas.openxmlformats.org/drawingml/2006/main" noChangeAspect="1"/>
             </wp:cNvGraphicFramePr>
@@ -1889,36 +1819,29 @@
               <a:graphicData uri="http://schemas.openxmlformats.org/drawingml/2006/picture">
                 <pic:pic xmlns:pic="http://schemas.openxmlformats.org/drawingml/2006/picture">
                   <pic:nvPicPr>
-                    <pic:cNvPr id="0" name="Picture 7" descr="Relatório"/>
-                    <pic:cNvPicPr>
-                      <a:picLocks noChangeAspect="1" noChangeArrowheads="1"/>
-                    </pic:cNvPicPr>
+                    <pic:cNvPr id="6" name=""/>
+                    <pic:cNvPicPr/>
                   </pic:nvPicPr>
                   <pic:blipFill>
-                    <a:blip r:link="rId11">
+                    <a:blip r:embed="rId11" cstate="print">
                       <a:extLst>
                         <a:ext uri="{28A0092B-C50C-407E-A947-70E740481C1C}">
                           <a14:useLocalDpi xmlns:a14="http://schemas.microsoft.com/office/drawing/2010/main" val="0"/>
                         </a:ext>
                       </a:extLst>
                     </a:blip>
-                    <a:srcRect/>
                     <a:stretch>
                       <a:fillRect/>
                     </a:stretch>
                   </pic:blipFill>
-                  <pic:spPr bwMode="auto">
+                  <pic:spPr>
                     <a:xfrm>
                       <a:off x="0" y="0"/>
-                      <a:ext cx="10287000" cy="22860000"/>
+                      <a:ext cx="2921000" cy="6490905"/>
                     </a:xfrm>
                     <a:prstGeom prst="rect">
                       <a:avLst/>
                     </a:prstGeom>
-                    <a:noFill/>
-                    <a:ln>
-                      <a:noFill/>
-                    </a:ln>
                   </pic:spPr>
                 </pic:pic>
               </a:graphicData>
@@ -1929,9 +1852,8 @@
     </w:p>
     <w:p>
       <w:pPr>
-        <w:spacing w:before="60" w:after="210"/>
         <w:jc w:val="center"/>
-        <w:divId w:val="1641568331"/>
+        <w:divId w:val="2130780308"/>
         <w:rPr>
           <w:rFonts w:ascii="Segoe UI" w:eastAsia="Times New Roman" w:hAnsi="Segoe UI" w:cs="Segoe UI"/>
           <w:color w:val="666666"/>
@@ -2028,16 +1950,7 @@
           <w:sz w:val="22"/>
           <w:szCs w:val="22"/>
         </w:rPr>
-        <w:t xml:space="preserve"> </w:t>
-      </w:r>
-      <w:r>
-        <w:rPr>
-          <w:rFonts w:ascii="Segoe UI" w:eastAsia="Times New Roman" w:hAnsi="Segoe UI" w:cs="Segoe UI"/>
-          <w:color w:val="222222"/>
-          <w:sz w:val="22"/>
-          <w:szCs w:val="22"/>
-        </w:rPr>
-        <w:t>— o site pode estar temporariamente lento; espere alguns segundos.</w:t>
+        <w:t xml:space="preserve"> — o site pode estar temporariamente lento; espere alguns segundos.</w:t>
       </w:r>
     </w:p>
     <w:p>
@@ -2139,122 +2052,9 @@
 <file path=word/numbering.xml><?xml version="1.0" encoding="utf-8"?>
 <w:numbering xmlns:wpc="http://schemas.microsoft.com/office/word/2010/wordprocessingCanvas" xmlns:cx="http://schemas.microsoft.com/office/drawing/2014/chartex" xmlns:cx1="http://schemas.microsoft.com/office/drawing/2015/9/8/chartex" xmlns:cx2="http://schemas.microsoft.com/office/drawing/2015/10/21/chartex" xmlns:cx3="http://schemas.microsoft.com/office/drawing/2016/5/9/chartex" xmlns:cx4="http://schemas.microsoft.com/office/drawing/2016/5/10/chartex" xmlns:cx5="http://schemas.microsoft.com/office/drawing/2016/5/11/chartex" xmlns:cx6="http://schemas.microsoft.com/office/drawing/2016/5/12/chartex" xmlns:cx7="http://schemas.microsoft.com/office/drawing/2016/5/13/chartex" xmlns:cx8="http://schemas.microsoft.com/office/drawing/2016/5/14/chartex" xmlns:mc="http://schemas.openxmlformats.org/markup-compatibility/2006" xmlns:aink="http://schemas.microsoft.com/office/drawing/2016/ink" xmlns:am3d="http://schemas.microsoft.com/office/drawing/2017/model3d" xmlns:o="urn:schemas-microsoft-com:office:office" xmlns:oel="http://schemas.microsoft.com/office/2019/extlst" xmlns:r="http://schemas.openxmlformats.org/officeDocument/2006/relationships" xmlns:m="http://schemas.openxmlformats.org/officeDocument/2006/math" xmlns:v="urn:schemas-microsoft-com:vml" xmlns:wp14="http://schemas.microsoft.com/office/word/2010/wordprocessingDrawing" xmlns:wp="http://schemas.openxmlformats.org/drawingml/2006/wordprocessingDrawing" xmlns:w10="urn:schemas-microsoft-com:office:word" xmlns:w="http://schemas.openxmlformats.org/wordprocessingml/2006/main" xmlns:w14="http://schemas.microsoft.com/office/word/2010/wordml" xmlns:w15="http://schemas.microsoft.com/office/word/2012/wordml" xmlns:w16cex="http://schemas.microsoft.com/office/word/2018/wordml/cex" xmlns:w16cid="http://schemas.microsoft.com/office/word/2016/wordml/cid" xmlns:w16="http://schemas.microsoft.com/office/word/2018/wordml" xmlns:w16sdtdh="http://schemas.microsoft.com/office/word/2020/wordml/sdtdatahash" xmlns:w16se="http://schemas.microsoft.com/office/word/2015/wordml/symex" xmlns:wpg="http://schemas.microsoft.com/office/word/2010/wordprocessingGroup" xmlns:wpi="http://schemas.microsoft.com/office/word/2010/wordprocessingInk" xmlns:wne="http://schemas.microsoft.com/office/word/2006/wordml" xmlns:wps="http://schemas.microsoft.com/office/word/2010/wordprocessingShape" mc:Ignorable="w14 w15 w16se w16cid w16 w16cex w16sdtdh wp14">
   <w:abstractNum w:abstractNumId="0" w15:restartNumberingAfterBreak="0">
-    <w:nsid w:val="139F5D4C"/>
+    <w:nsid w:val="014975C5"/>
     <w:multiLevelType w:val="multilevel"/>
-    <w:tmpl w:val="0CE28F5C"/>
-    <w:lvl w:ilvl="0">
-      <w:start w:val="1"/>
-      <w:numFmt w:val="decimal"/>
-      <w:lvlText w:val="%1."/>
-      <w:lvlJc w:val="left"/>
-      <w:pPr>
-        <w:tabs>
-          <w:tab w:val="num" w:pos="720"/>
-        </w:tabs>
-        <w:ind w:left="720" w:hanging="360"/>
-      </w:pPr>
-    </w:lvl>
-    <w:lvl w:ilvl="1" w:tentative="1">
-      <w:start w:val="1"/>
-      <w:numFmt w:val="decimal"/>
-      <w:lvlText w:val="%2."/>
-      <w:lvlJc w:val="left"/>
-      <w:pPr>
-        <w:tabs>
-          <w:tab w:val="num" w:pos="1440"/>
-        </w:tabs>
-        <w:ind w:left="1440" w:hanging="360"/>
-      </w:pPr>
-    </w:lvl>
-    <w:lvl w:ilvl="2" w:tentative="1">
-      <w:start w:val="1"/>
-      <w:numFmt w:val="decimal"/>
-      <w:lvlText w:val="%3."/>
-      <w:lvlJc w:val="left"/>
-      <w:pPr>
-        <w:tabs>
-          <w:tab w:val="num" w:pos="2160"/>
-        </w:tabs>
-        <w:ind w:left="2160" w:hanging="360"/>
-      </w:pPr>
-    </w:lvl>
-    <w:lvl w:ilvl="3" w:tentative="1">
-      <w:start w:val="1"/>
-      <w:numFmt w:val="decimal"/>
-      <w:lvlText w:val="%4."/>
-      <w:lvlJc w:val="left"/>
-      <w:pPr>
-        <w:tabs>
-          <w:tab w:val="num" w:pos="2880"/>
-        </w:tabs>
-        <w:ind w:left="2880" w:hanging="360"/>
-      </w:pPr>
-    </w:lvl>
-    <w:lvl w:ilvl="4" w:tentative="1">
-      <w:start w:val="1"/>
-      <w:numFmt w:val="decimal"/>
-      <w:lvlText w:val="%5."/>
-      <w:lvlJc w:val="left"/>
-      <w:pPr>
-        <w:tabs>
-          <w:tab w:val="num" w:pos="3600"/>
-        </w:tabs>
-        <w:ind w:left="3600" w:hanging="360"/>
-      </w:pPr>
-    </w:lvl>
-    <w:lvl w:ilvl="5" w:tentative="1">
-      <w:start w:val="1"/>
-      <w:numFmt w:val="decimal"/>
-      <w:lvlText w:val="%6."/>
-      <w:lvlJc w:val="left"/>
-      <w:pPr>
-        <w:tabs>
-          <w:tab w:val="num" w:pos="4320"/>
-        </w:tabs>
-        <w:ind w:left="4320" w:hanging="360"/>
-      </w:pPr>
-    </w:lvl>
-    <w:lvl w:ilvl="6" w:tentative="1">
-      <w:start w:val="1"/>
-      <w:numFmt w:val="decimal"/>
-      <w:lvlText w:val="%7."/>
-      <w:lvlJc w:val="left"/>
-      <w:pPr>
-        <w:tabs>
-          <w:tab w:val="num" w:pos="5040"/>
-        </w:tabs>
-        <w:ind w:left="5040" w:hanging="360"/>
-      </w:pPr>
-    </w:lvl>
-    <w:lvl w:ilvl="7" w:tentative="1">
-      <w:start w:val="1"/>
-      <w:numFmt w:val="decimal"/>
-      <w:lvlText w:val="%8."/>
-      <w:lvlJc w:val="left"/>
-      <w:pPr>
-        <w:tabs>
-          <w:tab w:val="num" w:pos="5760"/>
-        </w:tabs>
-        <w:ind w:left="5760" w:hanging="360"/>
-      </w:pPr>
-    </w:lvl>
-    <w:lvl w:ilvl="8" w:tentative="1">
-      <w:start w:val="1"/>
-      <w:numFmt w:val="decimal"/>
-      <w:lvlText w:val="%9."/>
-      <w:lvlJc w:val="left"/>
-      <w:pPr>
-        <w:tabs>
-          <w:tab w:val="num" w:pos="6480"/>
-        </w:tabs>
-        <w:ind w:left="6480" w:hanging="360"/>
-      </w:pPr>
-    </w:lvl>
-  </w:abstractNum>
-  <w:abstractNum w:abstractNumId="1" w15:restartNumberingAfterBreak="0">
-    <w:nsid w:val="1CCE4A8B"/>
-    <w:multiLevelType w:val="multilevel"/>
-    <w:tmpl w:val="E6025CF8"/>
+    <w:tmpl w:val="99143730"/>
     <w:lvl w:ilvl="0">
       <w:start w:val="1"/>
       <w:numFmt w:val="bullet"/>
@@ -2400,123 +2200,10 @@
       </w:rPr>
     </w:lvl>
   </w:abstractNum>
-  <w:abstractNum w:abstractNumId="2" w15:restartNumberingAfterBreak="0">
-    <w:nsid w:val="6FD053E1"/>
+  <w:abstractNum w:abstractNumId="1" w15:restartNumberingAfterBreak="0">
+    <w:nsid w:val="3D220F6C"/>
     <w:multiLevelType w:val="multilevel"/>
-    <w:tmpl w:val="6C58D7CA"/>
-    <w:lvl w:ilvl="0">
-      <w:start w:val="1"/>
-      <w:numFmt w:val="decimal"/>
-      <w:lvlText w:val="%1."/>
-      <w:lvlJc w:val="left"/>
-      <w:pPr>
-        <w:tabs>
-          <w:tab w:val="num" w:pos="720"/>
-        </w:tabs>
-        <w:ind w:left="720" w:hanging="360"/>
-      </w:pPr>
-    </w:lvl>
-    <w:lvl w:ilvl="1" w:tentative="1">
-      <w:start w:val="1"/>
-      <w:numFmt w:val="decimal"/>
-      <w:lvlText w:val="%2."/>
-      <w:lvlJc w:val="left"/>
-      <w:pPr>
-        <w:tabs>
-          <w:tab w:val="num" w:pos="1440"/>
-        </w:tabs>
-        <w:ind w:left="1440" w:hanging="360"/>
-      </w:pPr>
-    </w:lvl>
-    <w:lvl w:ilvl="2" w:tentative="1">
-      <w:start w:val="1"/>
-      <w:numFmt w:val="decimal"/>
-      <w:lvlText w:val="%3."/>
-      <w:lvlJc w:val="left"/>
-      <w:pPr>
-        <w:tabs>
-          <w:tab w:val="num" w:pos="2160"/>
-        </w:tabs>
-        <w:ind w:left="2160" w:hanging="360"/>
-      </w:pPr>
-    </w:lvl>
-    <w:lvl w:ilvl="3" w:tentative="1">
-      <w:start w:val="1"/>
-      <w:numFmt w:val="decimal"/>
-      <w:lvlText w:val="%4."/>
-      <w:lvlJc w:val="left"/>
-      <w:pPr>
-        <w:tabs>
-          <w:tab w:val="num" w:pos="2880"/>
-        </w:tabs>
-        <w:ind w:left="2880" w:hanging="360"/>
-      </w:pPr>
-    </w:lvl>
-    <w:lvl w:ilvl="4" w:tentative="1">
-      <w:start w:val="1"/>
-      <w:numFmt w:val="decimal"/>
-      <w:lvlText w:val="%5."/>
-      <w:lvlJc w:val="left"/>
-      <w:pPr>
-        <w:tabs>
-          <w:tab w:val="num" w:pos="3600"/>
-        </w:tabs>
-        <w:ind w:left="3600" w:hanging="360"/>
-      </w:pPr>
-    </w:lvl>
-    <w:lvl w:ilvl="5" w:tentative="1">
-      <w:start w:val="1"/>
-      <w:numFmt w:val="decimal"/>
-      <w:lvlText w:val="%6."/>
-      <w:lvlJc w:val="left"/>
-      <w:pPr>
-        <w:tabs>
-          <w:tab w:val="num" w:pos="4320"/>
-        </w:tabs>
-        <w:ind w:left="4320" w:hanging="360"/>
-      </w:pPr>
-    </w:lvl>
-    <w:lvl w:ilvl="6" w:tentative="1">
-      <w:start w:val="1"/>
-      <w:numFmt w:val="decimal"/>
-      <w:lvlText w:val="%7."/>
-      <w:lvlJc w:val="left"/>
-      <w:pPr>
-        <w:tabs>
-          <w:tab w:val="num" w:pos="5040"/>
-        </w:tabs>
-        <w:ind w:left="5040" w:hanging="360"/>
-      </w:pPr>
-    </w:lvl>
-    <w:lvl w:ilvl="7" w:tentative="1">
-      <w:start w:val="1"/>
-      <w:numFmt w:val="decimal"/>
-      <w:lvlText w:val="%8."/>
-      <w:lvlJc w:val="left"/>
-      <w:pPr>
-        <w:tabs>
-          <w:tab w:val="num" w:pos="5760"/>
-        </w:tabs>
-        <w:ind w:left="5760" w:hanging="360"/>
-      </w:pPr>
-    </w:lvl>
-    <w:lvl w:ilvl="8" w:tentative="1">
-      <w:start w:val="1"/>
-      <w:numFmt w:val="decimal"/>
-      <w:lvlText w:val="%9."/>
-      <w:lvlJc w:val="left"/>
-      <w:pPr>
-        <w:tabs>
-          <w:tab w:val="num" w:pos="6480"/>
-        </w:tabs>
-        <w:ind w:left="6480" w:hanging="360"/>
-      </w:pPr>
-    </w:lvl>
-  </w:abstractNum>
-  <w:abstractNum w:abstractNumId="3" w15:restartNumberingAfterBreak="0">
-    <w:nsid w:val="752C5AC8"/>
-    <w:multiLevelType w:val="multilevel"/>
-    <w:tmpl w:val="CE8686DA"/>
+    <w:tmpl w:val="89F60208"/>
     <w:lvl w:ilvl="0">
       <w:start w:val="1"/>
       <w:numFmt w:val="bullet"/>
@@ -2662,10 +2349,123 @@
       </w:rPr>
     </w:lvl>
   </w:abstractNum>
-  <w:abstractNum w:abstractNumId="4" w15:restartNumberingAfterBreak="0">
-    <w:nsid w:val="7A0C772F"/>
+  <w:abstractNum w:abstractNumId="2" w15:restartNumberingAfterBreak="0">
+    <w:nsid w:val="40111E9D"/>
     <w:multiLevelType w:val="multilevel"/>
-    <w:tmpl w:val="42D42B3C"/>
+    <w:tmpl w:val="23AAB664"/>
+    <w:lvl w:ilvl="0">
+      <w:start w:val="1"/>
+      <w:numFmt w:val="decimal"/>
+      <w:lvlText w:val="%1."/>
+      <w:lvlJc w:val="left"/>
+      <w:pPr>
+        <w:tabs>
+          <w:tab w:val="num" w:pos="720"/>
+        </w:tabs>
+        <w:ind w:left="720" w:hanging="360"/>
+      </w:pPr>
+    </w:lvl>
+    <w:lvl w:ilvl="1" w:tentative="1">
+      <w:start w:val="1"/>
+      <w:numFmt w:val="decimal"/>
+      <w:lvlText w:val="%2."/>
+      <w:lvlJc w:val="left"/>
+      <w:pPr>
+        <w:tabs>
+          <w:tab w:val="num" w:pos="1440"/>
+        </w:tabs>
+        <w:ind w:left="1440" w:hanging="360"/>
+      </w:pPr>
+    </w:lvl>
+    <w:lvl w:ilvl="2" w:tentative="1">
+      <w:start w:val="1"/>
+      <w:numFmt w:val="decimal"/>
+      <w:lvlText w:val="%3."/>
+      <w:lvlJc w:val="left"/>
+      <w:pPr>
+        <w:tabs>
+          <w:tab w:val="num" w:pos="2160"/>
+        </w:tabs>
+        <w:ind w:left="2160" w:hanging="360"/>
+      </w:pPr>
+    </w:lvl>
+    <w:lvl w:ilvl="3" w:tentative="1">
+      <w:start w:val="1"/>
+      <w:numFmt w:val="decimal"/>
+      <w:lvlText w:val="%4."/>
+      <w:lvlJc w:val="left"/>
+      <w:pPr>
+        <w:tabs>
+          <w:tab w:val="num" w:pos="2880"/>
+        </w:tabs>
+        <w:ind w:left="2880" w:hanging="360"/>
+      </w:pPr>
+    </w:lvl>
+    <w:lvl w:ilvl="4" w:tentative="1">
+      <w:start w:val="1"/>
+      <w:numFmt w:val="decimal"/>
+      <w:lvlText w:val="%5."/>
+      <w:lvlJc w:val="left"/>
+      <w:pPr>
+        <w:tabs>
+          <w:tab w:val="num" w:pos="3600"/>
+        </w:tabs>
+        <w:ind w:left="3600" w:hanging="360"/>
+      </w:pPr>
+    </w:lvl>
+    <w:lvl w:ilvl="5" w:tentative="1">
+      <w:start w:val="1"/>
+      <w:numFmt w:val="decimal"/>
+      <w:lvlText w:val="%6."/>
+      <w:lvlJc w:val="left"/>
+      <w:pPr>
+        <w:tabs>
+          <w:tab w:val="num" w:pos="4320"/>
+        </w:tabs>
+        <w:ind w:left="4320" w:hanging="360"/>
+      </w:pPr>
+    </w:lvl>
+    <w:lvl w:ilvl="6" w:tentative="1">
+      <w:start w:val="1"/>
+      <w:numFmt w:val="decimal"/>
+      <w:lvlText w:val="%7."/>
+      <w:lvlJc w:val="left"/>
+      <w:pPr>
+        <w:tabs>
+          <w:tab w:val="num" w:pos="5040"/>
+        </w:tabs>
+        <w:ind w:left="5040" w:hanging="360"/>
+      </w:pPr>
+    </w:lvl>
+    <w:lvl w:ilvl="7" w:tentative="1">
+      <w:start w:val="1"/>
+      <w:numFmt w:val="decimal"/>
+      <w:lvlText w:val="%8."/>
+      <w:lvlJc w:val="left"/>
+      <w:pPr>
+        <w:tabs>
+          <w:tab w:val="num" w:pos="5760"/>
+        </w:tabs>
+        <w:ind w:left="5760" w:hanging="360"/>
+      </w:pPr>
+    </w:lvl>
+    <w:lvl w:ilvl="8" w:tentative="1">
+      <w:start w:val="1"/>
+      <w:numFmt w:val="decimal"/>
+      <w:lvlText w:val="%9."/>
+      <w:lvlJc w:val="left"/>
+      <w:pPr>
+        <w:tabs>
+          <w:tab w:val="num" w:pos="6480"/>
+        </w:tabs>
+        <w:ind w:left="6480" w:hanging="360"/>
+      </w:pPr>
+    </w:lvl>
+  </w:abstractNum>
+  <w:abstractNum w:abstractNumId="3" w15:restartNumberingAfterBreak="0">
+    <w:nsid w:val="57692591"/>
+    <w:multiLevelType w:val="multilevel"/>
+    <w:tmpl w:val="D5F81ABC"/>
     <w:lvl w:ilvl="0">
       <w:start w:val="1"/>
       <w:numFmt w:val="bullet"/>
@@ -2811,20 +2611,133 @@
       </w:rPr>
     </w:lvl>
   </w:abstractNum>
-  <w:num w:numId="1" w16cid:durableId="829834384">
-    <w:abstractNumId w:val="0"/>
-  </w:num>
-  <w:num w:numId="2" w16cid:durableId="242568166">
+  <w:abstractNum w:abstractNumId="4" w15:restartNumberingAfterBreak="0">
+    <w:nsid w:val="68135DD5"/>
+    <w:multiLevelType w:val="multilevel"/>
+    <w:tmpl w:val="1EAE3D20"/>
+    <w:lvl w:ilvl="0">
+      <w:start w:val="1"/>
+      <w:numFmt w:val="decimal"/>
+      <w:lvlText w:val="%1."/>
+      <w:lvlJc w:val="left"/>
+      <w:pPr>
+        <w:tabs>
+          <w:tab w:val="num" w:pos="720"/>
+        </w:tabs>
+        <w:ind w:left="720" w:hanging="360"/>
+      </w:pPr>
+    </w:lvl>
+    <w:lvl w:ilvl="1" w:tentative="1">
+      <w:start w:val="1"/>
+      <w:numFmt w:val="decimal"/>
+      <w:lvlText w:val="%2."/>
+      <w:lvlJc w:val="left"/>
+      <w:pPr>
+        <w:tabs>
+          <w:tab w:val="num" w:pos="1440"/>
+        </w:tabs>
+        <w:ind w:left="1440" w:hanging="360"/>
+      </w:pPr>
+    </w:lvl>
+    <w:lvl w:ilvl="2" w:tentative="1">
+      <w:start w:val="1"/>
+      <w:numFmt w:val="decimal"/>
+      <w:lvlText w:val="%3."/>
+      <w:lvlJc w:val="left"/>
+      <w:pPr>
+        <w:tabs>
+          <w:tab w:val="num" w:pos="2160"/>
+        </w:tabs>
+        <w:ind w:left="2160" w:hanging="360"/>
+      </w:pPr>
+    </w:lvl>
+    <w:lvl w:ilvl="3" w:tentative="1">
+      <w:start w:val="1"/>
+      <w:numFmt w:val="decimal"/>
+      <w:lvlText w:val="%4."/>
+      <w:lvlJc w:val="left"/>
+      <w:pPr>
+        <w:tabs>
+          <w:tab w:val="num" w:pos="2880"/>
+        </w:tabs>
+        <w:ind w:left="2880" w:hanging="360"/>
+      </w:pPr>
+    </w:lvl>
+    <w:lvl w:ilvl="4" w:tentative="1">
+      <w:start w:val="1"/>
+      <w:numFmt w:val="decimal"/>
+      <w:lvlText w:val="%5."/>
+      <w:lvlJc w:val="left"/>
+      <w:pPr>
+        <w:tabs>
+          <w:tab w:val="num" w:pos="3600"/>
+        </w:tabs>
+        <w:ind w:left="3600" w:hanging="360"/>
+      </w:pPr>
+    </w:lvl>
+    <w:lvl w:ilvl="5" w:tentative="1">
+      <w:start w:val="1"/>
+      <w:numFmt w:val="decimal"/>
+      <w:lvlText w:val="%6."/>
+      <w:lvlJc w:val="left"/>
+      <w:pPr>
+        <w:tabs>
+          <w:tab w:val="num" w:pos="4320"/>
+        </w:tabs>
+        <w:ind w:left="4320" w:hanging="360"/>
+      </w:pPr>
+    </w:lvl>
+    <w:lvl w:ilvl="6" w:tentative="1">
+      <w:start w:val="1"/>
+      <w:numFmt w:val="decimal"/>
+      <w:lvlText w:val="%7."/>
+      <w:lvlJc w:val="left"/>
+      <w:pPr>
+        <w:tabs>
+          <w:tab w:val="num" w:pos="5040"/>
+        </w:tabs>
+        <w:ind w:left="5040" w:hanging="360"/>
+      </w:pPr>
+    </w:lvl>
+    <w:lvl w:ilvl="7" w:tentative="1">
+      <w:start w:val="1"/>
+      <w:numFmt w:val="decimal"/>
+      <w:lvlText w:val="%8."/>
+      <w:lvlJc w:val="left"/>
+      <w:pPr>
+        <w:tabs>
+          <w:tab w:val="num" w:pos="5760"/>
+        </w:tabs>
+        <w:ind w:left="5760" w:hanging="360"/>
+      </w:pPr>
+    </w:lvl>
+    <w:lvl w:ilvl="8" w:tentative="1">
+      <w:start w:val="1"/>
+      <w:numFmt w:val="decimal"/>
+      <w:lvlText w:val="%9."/>
+      <w:lvlJc w:val="left"/>
+      <w:pPr>
+        <w:tabs>
+          <w:tab w:val="num" w:pos="6480"/>
+        </w:tabs>
+        <w:ind w:left="6480" w:hanging="360"/>
+      </w:pPr>
+    </w:lvl>
+  </w:abstractNum>
+  <w:num w:numId="1" w16cid:durableId="948975139">
     <w:abstractNumId w:val="4"/>
   </w:num>
-  <w:num w:numId="3" w16cid:durableId="2046636346">
+  <w:num w:numId="2" w16cid:durableId="674723320">
+    <w:abstractNumId w:val="1"/>
+  </w:num>
+  <w:num w:numId="3" w16cid:durableId="1215506008">
     <w:abstractNumId w:val="2"/>
   </w:num>
-  <w:num w:numId="4" w16cid:durableId="30738804">
+  <w:num w:numId="4" w16cid:durableId="1965185621">
     <w:abstractNumId w:val="3"/>
   </w:num>
-  <w:num w:numId="5" w16cid:durableId="2034724924">
-    <w:abstractNumId w:val="1"/>
+  <w:num w:numId="5" w16cid:durableId="1453204709">
+    <w:abstractNumId w:val="0"/>
   </w:num>
 </w:numbering>
 </file>

</xml_diff>